<commit_message>
docs: render 5G NRF scientific manuscript DOCX
</commit_message>
<xml_diff>
--- a/article_open5gs_nrf/5g_nrf_kie_article_draft.docx
+++ b/article_open5gs_nrf/5g_nrf_kie_article_draft.docx
@@ -42,7 +42,7 @@
     </w:p>
     <w:p>
       <w:r>
-        <w:t>Рассмотрена задача выявления расхождения между фактически наблюдаемой сигнальной активностью сервисно-ориентированной сети 5G и сообщаемым состоянием сетевой функции. Объектом исследования служат обращения HTTP/2 к функции репозитория сетевых функций NRF (Network Repository Function), реализованной в Open5GS. Предложен порядок проверки, при котором событие сначала устанавливается по пакетной записи, а затем сопоставляется с подписанной телеметрией KIE двух фиксированных версий. Определение начала всплеска связано с первым зарегистрированным запросом, а не с центром агрегированного интервала. Исследованы периоды опроса 1, 2 и 4 с, два профиля интенсивности и управляемое сокрытие телеметрического отклика. В исходной серии из 144 воздействий пакетное восстановление подтвердило 144 события вместо 129 при использовании неподвижных двухсекундных интервалов. В дополнительной проспективной серии на шести средах Ubuntu 24.04 два процесса захвата согласованно подтвердили 72 из 72 событий; 24 контрольных окна не содержали ложных сетевых всплесков. Показано, что совпадение сетевых свидетельств не устраняет ошибок решения о сокрытии, особенно при увеличении периода опроса. Сформулированы ограничения применимости лабораторных результатов и требования к дальнейшей проверке метода.</w:t>
+        <w:t>На основании анализа нормативных документов и исследований сетевых аномалий рассмотрена задача выявления расхождения между фактически наблюдаемой сигнальной активностью сервисно-ориентированной сети 5G и сообщаемым состоянием сетевой функции. Объектом исследования служат обращения HTTP/2 к функции репозитория сетевых функций NRF (Network Repository Function), реализованной в Open5GS. Предложен порядок проверки, при котором событие сначала устанавливается по пакетной записи, а затем сопоставляется с подписанной телеметрией KIE двух фиксированных версий. Определение начала всплеска связано с первым зарегистрированным запросом, а не с центром агрегированного интервала. Исследованы периоды опроса 1, 2 и 4 с, два профиля интенсивности и управляемое сокрытие телеметрического отклика. В исходной серии из 144 воздействий пакетное восстановление подтвердило 144 события вместо 129 при использовании неподвижных двухсекундных интервалов. В дополнительной проспективной серии на шести средах Ubuntu 24.04 два процесса захвата согласованно подтвердили 72 из 72 событий; 24 контрольных окна не содержали ложных сетевых всплесков. Показано, что совпадение сетевых свидетельств не устраняет ошибок решения о сокрытии, особенно при увеличении периода опроса. Сформулированы ограничения применимости лабораторных результатов и требования к дальнейшей проверке метода.</w:t>
       </w:r>
     </w:p>
     <w:p>
@@ -66,12 +66,12 @@
     </w:p>
     <w:p>
       <w:r>
-        <w:t>В сетях мобильной связи устойчивость управляющих функций определяется не только пропускной способностью транспортной подсистемы, но и возможностью своевременно установить нарушение сигнального обмена. При анализе систем сигнализации предыдущих поколений существенное значение имела оценка последствий нарушения функций маршрутизации и недостаточности защитных механизмов [30]. В сервисно-ориентированной архитектуре ядра 5G постановка задачи меняется: взаимодействие сетевых функций осуществляется через программные интерфейсы, а факт сетевого обращения и его отражение в средствах мониторинга могут расходиться [1–6].</w:t>
+        <w:t>В сетях мобильной связи устойчивость управляющих функций определяется не только пропускной способностью транспортной подсистемы, но и возможностью своевременно установить нарушение сигнального обмена. При анализе систем сигнализации предыдущих поколений существенное значение имела оценка последствий нарушения функций маршрутизации и недостаточности защитных механизмов [1, 2]. В сервисно-ориентированной архитектуре ядра 5G постановка задачи меняется: взаимодействие сетевых функций осуществляется через программные интерфейсы, а факт сетевого обращения и его отражение в средствах мониторинга могут расходиться [3–8].</w:t>
       </w:r>
     </w:p>
     <w:p>
       <w:r>
-        <w:t>Функция NRF обеспечивает регистрацию и обнаружение сетевых функций, вследствие чего интенсивность запросов к ней представляет интерес при исследовании доступности сервисов управления. Использование HTTP/2 повышает эффективность обмена, но одновременно требует анализа запросов на прикладном уровне, поскольку характеристики отдельного TCP-соединения не полностью описывают число выполняемых операций [5, 7, 8, 22, 23]. Наличие средств аутентификации и защиты транспортного канала не исключает перегрузку со стороны авторизованного потребителя либо ошибочное отражение состояния контролируемого процесса [6, 9–12].</w:t>
+        <w:t>Функция NRF обеспечивает регистрацию и обнаружение сетевых функций, вследствие чего интенсивность запросов к ней представляет интерес при исследовании доступности сервисов управления. Использование HTTP/2 повышает эффективность обмена, но одновременно требует анализа запросов на прикладном уровне, поскольку характеристики отдельного TCP-соединения не полностью описывают число выполняемых операций [7, 9–12]. Наличие средств аутентификации и защиты транспортного канала не исключает перегрузку со стороны авторизованного потребителя либо ошибочное отражение состояния контролируемого процесса [8, 13–16].</w:t>
       </w:r>
     </w:p>
     <w:p>
@@ -94,22 +94,909 @@
     </w:p>
     <w:p>
       <w:r>
-        <w:t>Архитектура 5G Core и процедуры обнаружения сетевых функций описаны спецификациями 3GPP [1–6]. Работы, посвященные безопасности ядра 5G, выделяют угрозы сервисным интерфейсам, доверительным отношениям между функциями и устойчивости прикладных протоколов [18–22]. В исследовании Wehbe и соавторов показана специфика рисков HTTP/2 в SBA [22], а система 5GShield использует прикладные признаки для обнаружения аномалий HTTP/2 [23]. Экспериментальная оценка открытых реализаций ядра 5G подтверждает практическую значимость проверки функций NRF и других компонентов на реальном программном стенде [24].</w:t>
+        <w:rPr>
+          <w:b/>
+        </w:rPr>
+        <w:t>1.1. Сервисная архитектура 5G и источники наблюдения.</w:t>
+      </w:r>
+      <w:r>
+        <w:t xml:space="preserve"> В архитектуре 5G Core сетевые функции взаимодействуют посредством сервисных интерфейсов SBA. Функция NRF поддерживает регистрацию, обновление состояния и обнаружение экземпляров NF, а операции Nnrf реализуются через программные интерфейсы HTTP [3–8]. В спецификациях 3GPP определены процедуры обслуживания NF и принципы безопасности, тогда как измерение эксплуатационных характеристик рассматривается в отдельной группе нормативных документов [17]. Поэтому сведения о выполненном запросе и сведения о состоянии обслуживающей его функции имеют различное происхождение и должны анализироваться как самостоятельные измерения.</w:t>
       </w:r>
     </w:p>
     <w:p>
       <w:r>
-        <w:t>Указанные направления преимущественно решают задачу распознавания подозрительного сетевого поведения. Другая группа исследований рассматривает аномалии временных рядов, сетевые сенсоры и ограничения методов машинного обучения при изменении условий эксплуатации [25–29]. Эти результаты позволяют обосновать необходимость внешнего наблюдения, но сами по себе не отвечают на вопрос, соответствует ли подписанный отчет конкретному, физически зафиксированному всплеску запросов.</w:t>
+        <w:t>Обзор угроз ENISA [18] дополняет нормативное описание прикладными сценариями нарушения безопасности. Протокол HTTP/2 позволяет передавать множество потоков запросов в одном соединении [9, 10]. Следовательно, количество TCP-соединений не является достаточным признаком интенсивности сигнального обмена. Для NRF более непосредственно интерпретируются метод HTTP, путь к ресурсу, идентификатор HTTP/2-потока и временная метка обращения. Такие признаки могут быть восстановлены средствами Wireshark и tshark [19–21]. Уязвимости открытых реализаций ядра 5G также изучены в работе Dolente и соавторов [22]. Применимость пакетного захвата в открытых реализациях 5G Core исследована Živković и Čiča [23]. Однако успешное наблюдение пакета удостоверяет факт обмена в конкретной точке, но само по себе не устанавливает, что процесс NRF корректно отразил нагрузку во внутреннем измерителе.</w:t>
       </w:r>
     </w:p>
     <w:p>
       <w:r>
-        <w:t>Дополнительная трудность возникает при дискретном контроле состояния. Событие продолжительностью менее периода опроса может не попасть в отчет; при использовании неподвижных временных интервалов один всплеск может разделиться между соседними ячейками. В таком случае отсутствие реакции монитора нельзя без проверки считать признаком злонамеренного сокрытия. Аналогично корректная криптографическая подпись удостоверяет происхождение и неизменность сообщения в рамках модели доверия к ключу, но не доказывает истинность содержащегося в нем значения [13–17].</w:t>
+        <w:t>Переход от общего сетевого контроля к контролю отдельных функций согласуется с практикой использования Open5GS как исследовательского стенда [24, 25]. Zhang и соавторы описывают многоузловую испытательную среду на базе Open5GS [26]; Lando и соавторы рассматривают производительность открытых реализаций ядра 5G при выполнении типовых процедур [27]. Эти результаты обосновывают выбор открытой программной реализации для повторяемого опыта, но не устраняют вопрос о достоверности локальных показателей при расхождении с внешним трафиком.</w:t>
       </w:r>
     </w:p>
     <w:p>
       <w:r>
-        <w:t>Исследовательская задача формулируется следующим образом. Для интервала сигнальной активности необходимо независимо определить наличие события E, установить его начало t₀ по пакетам, проверить подлинность и полноту телеметрических отчетов, а затем вычислить решение D о подтверждении либо неподтверждении наблюдаемого воздействия. Экспериментальные метки «скрытый» и «правдивый» должны присоединяться только после получения D. Такая последовательность исключает прямое использование сценария вмешательства в детекторе и позволяет отдельно оценить ошибку внешнего свидетеля и ошибку интерпретации телеметрии.</w:t>
+        <w:rPr>
+          <w:b/>
+        </w:rPr>
+        <w:t>1.2. Подходы к обнаружению аномалий и пределы их доказательной силы.</w:t>
+      </w:r>
+      <w:r>
+        <w:t xml:space="preserve"> В исследованиях безопасности 5G Core можно выделить несколько направлений. Первое ориентировано на признаки сетевого взаимодействия и нарушение доступности сервисов. Обзорные работы Cao и соавторов, Tang и соавторов, а также Køien характеризуют риски SBA и границы доверия между сетевыми функциями [28–30]. Работы Wehbe и соавторов рассматривают угрозы применения HTTP/2 и средства обнаружения аномалий сервисного трафика [11, 12]. Loureiro и соавторы исследуют защиту NRF от сетевого воздействия средствами eBPF/XDP [31]. Преимуществом этого направления является непосредственная связь с наблюдаемым трафиком; ограничением — отсутствие гарантированного знания о фактическом внутреннем отклике NF.</w:t>
+      </w:r>
+    </w:p>
+    <w:p>
+      <w:r>
+        <w:t>Второе направление использует внутренние показатели процессов. Gopikrishnan и соавторы анализируют CPU/RAM-метрики функций 5G при регистрации пользовательского оборудования и сообщают о точности LSTM-AutoEncoder свыше 97 % для исследованных стрессовых аномалий [32]. В таком случае результат определяется как составом измеряемых метрик, так и их временной дискретизацией. Высокая точность распознавания не равнозначна независимому доказательству корректности самого измерителя. Для изучаемой задачи это различие принципиально: если отчеты процесса изменяются либо не поступают, детектор не должен без дополнительного свидетельства объявлять отсутствие сигнального события.</w:t>
+      </w:r>
+    </w:p>
+    <w:p>
+      <w:r>
+        <w:t>Третье направление связано с проверкой состояния протокола и реакции реализации. Работа CoreCrisis исследует контекстно-зависимое тестирование сетевых функций 5G и демонстрирует значимость последовательности сообщений для выявления отклонений [33]. Эксперименты по выявлению Mirai-активности в средах 5G/IoT [34], а также классические методы обнаружения вторжений и аномалий [35–39] подтверждают разнообразие применяемых признаков. Однако для оценки сокрытия телеметрического отклика требуется не просто классификация потока как аномального, а проверяемая привязка конкретного внешнего события к конкретному локальному отчету.</w:t>
+      </w:r>
+    </w:p>
+    <w:p>
+      <w:pPr>
+        <w:keepNext/>
+        <w:spacing w:before="140" w:after="100"/>
+        <w:ind w:firstLine="0"/>
+        <w:jc w:val="center"/>
+      </w:pPr>
+      <w:r>
+        <w:rPr>
+          <w:b/>
+        </w:rPr>
+        <w:t>Таблица 1 — Сопоставление направлений исследований с задачей независимой проверки NRF</w:t>
+      </w:r>
+    </w:p>
+    <w:tbl>
+      <w:tblPr>
+        <w:tblW w:type="auto" w:w="0"/>
+        <w:jc w:val="center"/>
+        <w:tblLayout w:type="autofit"/>
+        <w:tblLook w:firstColumn="1" w:firstRow="1" w:lastColumn="0" w:lastRow="0" w:noHBand="0" w:noVBand="1" w:val="04A0"/>
+      </w:tblPr>
+      <w:tblGrid>
+        <w:gridCol w:w="2367"/>
+        <w:gridCol w:w="2367"/>
+        <w:gridCol w:w="2367"/>
+        <w:gridCol w:w="2367"/>
+      </w:tblGrid>
+      <w:tr>
+        <w:tc>
+          <w:tcPr>
+            <w:tcW w:type="dxa" w:w="2367"/>
+            <w:vAlign w:val="center"/>
+            <w:tcBorders>
+              <w:top w:val="single" w:sz="5" w:color="CCD3DD"/>
+              <w:left w:val="single" w:sz="5" w:color="CCD3DD"/>
+              <w:bottom w:val="single" w:sz="5" w:color="CCD3DD"/>
+              <w:right w:val="single" w:sz="5" w:color="CCD3DD"/>
+            </w:tcBorders>
+            <w:shd w:fill="E8EEF6"/>
+          </w:tcPr>
+          <w:p>
+            <w:pPr>
+              <w:spacing w:after="40" w:before="40"/>
+              <w:ind w:firstLine="0"/>
+              <w:jc w:val="left"/>
+            </w:pPr>
+            <w:r>
+              <w:rPr>
+                <w:rFonts w:ascii="Times New Roman" w:hAnsi="Times New Roman"/>
+                <w:b/>
+                <w:sz w:val="19"/>
+              </w:rPr>
+              <w:t>Направление</w:t>
+            </w:r>
+          </w:p>
+        </w:tc>
+        <w:tc>
+          <w:tcPr>
+            <w:tcW w:type="dxa" w:w="2367"/>
+            <w:vAlign w:val="center"/>
+            <w:tcBorders>
+              <w:top w:val="single" w:sz="5" w:color="CCD3DD"/>
+              <w:left w:val="single" w:sz="5" w:color="CCD3DD"/>
+              <w:bottom w:val="single" w:sz="5" w:color="CCD3DD"/>
+              <w:right w:val="single" w:sz="5" w:color="CCD3DD"/>
+            </w:tcBorders>
+            <w:shd w:fill="E8EEF6"/>
+          </w:tcPr>
+          <w:p>
+            <w:pPr>
+              <w:spacing w:after="40" w:before="40"/>
+              <w:ind w:firstLine="0"/>
+              <w:jc w:val="center"/>
+            </w:pPr>
+            <w:r>
+              <w:rPr>
+                <w:rFonts w:ascii="Times New Roman" w:hAnsi="Times New Roman"/>
+                <w:b/>
+                <w:sz w:val="19"/>
+              </w:rPr>
+              <w:t>Характерные работы</w:t>
+            </w:r>
+          </w:p>
+        </w:tc>
+        <w:tc>
+          <w:tcPr>
+            <w:tcW w:type="dxa" w:w="2367"/>
+            <w:vAlign w:val="center"/>
+            <w:tcBorders>
+              <w:top w:val="single" w:sz="5" w:color="CCD3DD"/>
+              <w:left w:val="single" w:sz="5" w:color="CCD3DD"/>
+              <w:bottom w:val="single" w:sz="5" w:color="CCD3DD"/>
+              <w:right w:val="single" w:sz="5" w:color="CCD3DD"/>
+            </w:tcBorders>
+            <w:shd w:fill="E8EEF6"/>
+          </w:tcPr>
+          <w:p>
+            <w:pPr>
+              <w:spacing w:after="40" w:before="40"/>
+              <w:ind w:firstLine="0"/>
+              <w:jc w:val="center"/>
+            </w:pPr>
+            <w:r>
+              <w:rPr>
+                <w:rFonts w:ascii="Times New Roman" w:hAnsi="Times New Roman"/>
+                <w:b/>
+                <w:sz w:val="19"/>
+              </w:rPr>
+              <w:t>Источник признаков</w:t>
+            </w:r>
+          </w:p>
+        </w:tc>
+        <w:tc>
+          <w:tcPr>
+            <w:tcW w:type="dxa" w:w="2367"/>
+            <w:vAlign w:val="center"/>
+            <w:tcBorders>
+              <w:top w:val="single" w:sz="5" w:color="CCD3DD"/>
+              <w:left w:val="single" w:sz="5" w:color="CCD3DD"/>
+              <w:bottom w:val="single" w:sz="5" w:color="CCD3DD"/>
+              <w:right w:val="single" w:sz="5" w:color="CCD3DD"/>
+            </w:tcBorders>
+            <w:shd w:fill="E8EEF6"/>
+          </w:tcPr>
+          <w:p>
+            <w:pPr>
+              <w:spacing w:after="40" w:before="40"/>
+              <w:ind w:firstLine="0"/>
+              <w:jc w:val="center"/>
+            </w:pPr>
+            <w:r>
+              <w:rPr>
+                <w:rFonts w:ascii="Times New Roman" w:hAnsi="Times New Roman"/>
+                <w:b/>
+                <w:sz w:val="19"/>
+              </w:rPr>
+              <w:t>Ограничение применительно к KIE</w:t>
+            </w:r>
+          </w:p>
+        </w:tc>
+      </w:tr>
+      <w:tr>
+        <w:tc>
+          <w:tcPr>
+            <w:tcW w:type="dxa" w:w="2367"/>
+            <w:vAlign w:val="center"/>
+            <w:tcBorders>
+              <w:top w:val="single" w:sz="5" w:color="CCD3DD"/>
+              <w:left w:val="single" w:sz="5" w:color="CCD3DD"/>
+              <w:bottom w:val="single" w:sz="5" w:color="CCD3DD"/>
+              <w:right w:val="single" w:sz="5" w:color="CCD3DD"/>
+            </w:tcBorders>
+          </w:tcPr>
+          <w:p>
+            <w:pPr>
+              <w:spacing w:after="40" w:before="40"/>
+              <w:ind w:firstLine="0"/>
+              <w:jc w:val="left"/>
+            </w:pPr>
+            <w:r>
+              <w:rPr>
+                <w:rFonts w:ascii="Times New Roman" w:hAnsi="Times New Roman"/>
+                <w:sz w:val="19"/>
+              </w:rPr>
+              <w:t>Захват трафика 5GC</w:t>
+            </w:r>
+          </w:p>
+        </w:tc>
+        <w:tc>
+          <w:tcPr>
+            <w:tcW w:type="dxa" w:w="2367"/>
+            <w:vAlign w:val="center"/>
+            <w:tcBorders>
+              <w:top w:val="single" w:sz="5" w:color="CCD3DD"/>
+              <w:left w:val="single" w:sz="5" w:color="CCD3DD"/>
+              <w:bottom w:val="single" w:sz="5" w:color="CCD3DD"/>
+              <w:right w:val="single" w:sz="5" w:color="CCD3DD"/>
+            </w:tcBorders>
+          </w:tcPr>
+          <w:p>
+            <w:pPr>
+              <w:spacing w:after="40" w:before="40"/>
+              <w:ind w:firstLine="0"/>
+              <w:jc w:val="center"/>
+            </w:pPr>
+            <w:r>
+              <w:rPr>
+                <w:rFonts w:ascii="Times New Roman" w:hAnsi="Times New Roman"/>
+                <w:sz w:val="19"/>
+              </w:rPr>
+              <w:t>Živković, Čiča [23]</w:t>
+            </w:r>
+          </w:p>
+        </w:tc>
+        <w:tc>
+          <w:tcPr>
+            <w:tcW w:type="dxa" w:w="2367"/>
+            <w:vAlign w:val="center"/>
+            <w:tcBorders>
+              <w:top w:val="single" w:sz="5" w:color="CCD3DD"/>
+              <w:left w:val="single" w:sz="5" w:color="CCD3DD"/>
+              <w:bottom w:val="single" w:sz="5" w:color="CCD3DD"/>
+              <w:right w:val="single" w:sz="5" w:color="CCD3DD"/>
+            </w:tcBorders>
+          </w:tcPr>
+          <w:p>
+            <w:pPr>
+              <w:spacing w:after="40" w:before="40"/>
+              <w:ind w:firstLine="0"/>
+              <w:jc w:val="center"/>
+            </w:pPr>
+            <w:r>
+              <w:rPr>
+                <w:rFonts w:ascii="Times New Roman" w:hAnsi="Times New Roman"/>
+                <w:sz w:val="19"/>
+              </w:rPr>
+              <w:t>HTTP/2 и пакетные временные метки</w:t>
+            </w:r>
+          </w:p>
+        </w:tc>
+        <w:tc>
+          <w:tcPr>
+            <w:tcW w:type="dxa" w:w="2367"/>
+            <w:vAlign w:val="center"/>
+            <w:tcBorders>
+              <w:top w:val="single" w:sz="5" w:color="CCD3DD"/>
+              <w:left w:val="single" w:sz="5" w:color="CCD3DD"/>
+              <w:bottom w:val="single" w:sz="5" w:color="CCD3DD"/>
+              <w:right w:val="single" w:sz="5" w:color="CCD3DD"/>
+            </w:tcBorders>
+          </w:tcPr>
+          <w:p>
+            <w:pPr>
+              <w:spacing w:after="40" w:before="40"/>
+              <w:ind w:firstLine="0"/>
+              <w:jc w:val="center"/>
+            </w:pPr>
+            <w:r>
+              <w:rPr>
+                <w:rFonts w:ascii="Times New Roman" w:hAnsi="Times New Roman"/>
+                <w:sz w:val="19"/>
+              </w:rPr>
+              <w:t>Не удостоверяет внутреннее состояние NF</w:t>
+            </w:r>
+          </w:p>
+        </w:tc>
+      </w:tr>
+      <w:tr>
+        <w:tc>
+          <w:tcPr>
+            <w:tcW w:type="dxa" w:w="2367"/>
+            <w:vAlign w:val="center"/>
+            <w:tcBorders>
+              <w:top w:val="single" w:sz="5" w:color="CCD3DD"/>
+              <w:left w:val="single" w:sz="5" w:color="CCD3DD"/>
+              <w:bottom w:val="single" w:sz="5" w:color="CCD3DD"/>
+              <w:right w:val="single" w:sz="5" w:color="CCD3DD"/>
+            </w:tcBorders>
+          </w:tcPr>
+          <w:p>
+            <w:pPr>
+              <w:spacing w:after="40" w:before="40"/>
+              <w:ind w:firstLine="0"/>
+              <w:jc w:val="left"/>
+            </w:pPr>
+            <w:r>
+              <w:rPr>
+                <w:rFonts w:ascii="Times New Roman" w:hAnsi="Times New Roman"/>
+                <w:sz w:val="19"/>
+              </w:rPr>
+              <w:t>Аномалии ресурсов NF</w:t>
+            </w:r>
+          </w:p>
+        </w:tc>
+        <w:tc>
+          <w:tcPr>
+            <w:tcW w:type="dxa" w:w="2367"/>
+            <w:vAlign w:val="center"/>
+            <w:tcBorders>
+              <w:top w:val="single" w:sz="5" w:color="CCD3DD"/>
+              <w:left w:val="single" w:sz="5" w:color="CCD3DD"/>
+              <w:bottom w:val="single" w:sz="5" w:color="CCD3DD"/>
+              <w:right w:val="single" w:sz="5" w:color="CCD3DD"/>
+            </w:tcBorders>
+          </w:tcPr>
+          <w:p>
+            <w:pPr>
+              <w:spacing w:after="40" w:before="40"/>
+              <w:ind w:firstLine="0"/>
+              <w:jc w:val="center"/>
+            </w:pPr>
+            <w:r>
+              <w:rPr>
+                <w:rFonts w:ascii="Times New Roman" w:hAnsi="Times New Roman"/>
+                <w:sz w:val="19"/>
+              </w:rPr>
+              <w:t>Gopikrishnan и соавт. [32]</w:t>
+            </w:r>
+          </w:p>
+        </w:tc>
+        <w:tc>
+          <w:tcPr>
+            <w:tcW w:type="dxa" w:w="2367"/>
+            <w:vAlign w:val="center"/>
+            <w:tcBorders>
+              <w:top w:val="single" w:sz="5" w:color="CCD3DD"/>
+              <w:left w:val="single" w:sz="5" w:color="CCD3DD"/>
+              <w:bottom w:val="single" w:sz="5" w:color="CCD3DD"/>
+              <w:right w:val="single" w:sz="5" w:color="CCD3DD"/>
+            </w:tcBorders>
+          </w:tcPr>
+          <w:p>
+            <w:pPr>
+              <w:spacing w:after="40" w:before="40"/>
+              <w:ind w:firstLine="0"/>
+              <w:jc w:val="center"/>
+            </w:pPr>
+            <w:r>
+              <w:rPr>
+                <w:rFonts w:ascii="Times New Roman" w:hAnsi="Times New Roman"/>
+                <w:sz w:val="19"/>
+              </w:rPr>
+              <w:t>CPU и память сетевых функций</w:t>
+            </w:r>
+          </w:p>
+        </w:tc>
+        <w:tc>
+          <w:tcPr>
+            <w:tcW w:type="dxa" w:w="2367"/>
+            <w:vAlign w:val="center"/>
+            <w:tcBorders>
+              <w:top w:val="single" w:sz="5" w:color="CCD3DD"/>
+              <w:left w:val="single" w:sz="5" w:color="CCD3DD"/>
+              <w:bottom w:val="single" w:sz="5" w:color="CCD3DD"/>
+              <w:right w:val="single" w:sz="5" w:color="CCD3DD"/>
+            </w:tcBorders>
+          </w:tcPr>
+          <w:p>
+            <w:pPr>
+              <w:spacing w:after="40" w:before="40"/>
+              <w:ind w:firstLine="0"/>
+              <w:jc w:val="center"/>
+            </w:pPr>
+            <w:r>
+              <w:rPr>
+                <w:rFonts w:ascii="Times New Roman" w:hAnsi="Times New Roman"/>
+                <w:sz w:val="19"/>
+              </w:rPr>
+              <w:t>Достоверность измерителя принимается как предпосылка</w:t>
+            </w:r>
+          </w:p>
+        </w:tc>
+      </w:tr>
+      <w:tr>
+        <w:tc>
+          <w:tcPr>
+            <w:tcW w:type="dxa" w:w="2367"/>
+            <w:vAlign w:val="center"/>
+            <w:tcBorders>
+              <w:top w:val="single" w:sz="5" w:color="CCD3DD"/>
+              <w:left w:val="single" w:sz="5" w:color="CCD3DD"/>
+              <w:bottom w:val="single" w:sz="5" w:color="CCD3DD"/>
+              <w:right w:val="single" w:sz="5" w:color="CCD3DD"/>
+            </w:tcBorders>
+          </w:tcPr>
+          <w:p>
+            <w:pPr>
+              <w:spacing w:after="40" w:before="40"/>
+              <w:ind w:firstLine="0"/>
+              <w:jc w:val="left"/>
+            </w:pPr>
+            <w:r>
+              <w:rPr>
+                <w:rFonts w:ascii="Times New Roman" w:hAnsi="Times New Roman"/>
+                <w:sz w:val="19"/>
+              </w:rPr>
+              <w:t>Защита NRF от перегрузки</w:t>
+            </w:r>
+          </w:p>
+        </w:tc>
+        <w:tc>
+          <w:tcPr>
+            <w:tcW w:type="dxa" w:w="2367"/>
+            <w:vAlign w:val="center"/>
+            <w:tcBorders>
+              <w:top w:val="single" w:sz="5" w:color="CCD3DD"/>
+              <w:left w:val="single" w:sz="5" w:color="CCD3DD"/>
+              <w:bottom w:val="single" w:sz="5" w:color="CCD3DD"/>
+              <w:right w:val="single" w:sz="5" w:color="CCD3DD"/>
+            </w:tcBorders>
+          </w:tcPr>
+          <w:p>
+            <w:pPr>
+              <w:spacing w:after="40" w:before="40"/>
+              <w:ind w:firstLine="0"/>
+              <w:jc w:val="center"/>
+            </w:pPr>
+            <w:r>
+              <w:rPr>
+                <w:rFonts w:ascii="Times New Roman" w:hAnsi="Times New Roman"/>
+                <w:sz w:val="19"/>
+              </w:rPr>
+              <w:t>Loureiro и соавт. [31]</w:t>
+            </w:r>
+          </w:p>
+        </w:tc>
+        <w:tc>
+          <w:tcPr>
+            <w:tcW w:type="dxa" w:w="2367"/>
+            <w:vAlign w:val="center"/>
+            <w:tcBorders>
+              <w:top w:val="single" w:sz="5" w:color="CCD3DD"/>
+              <w:left w:val="single" w:sz="5" w:color="CCD3DD"/>
+              <w:bottom w:val="single" w:sz="5" w:color="CCD3DD"/>
+              <w:right w:val="single" w:sz="5" w:color="CCD3DD"/>
+            </w:tcBorders>
+          </w:tcPr>
+          <w:p>
+            <w:pPr>
+              <w:spacing w:after="40" w:before="40"/>
+              <w:ind w:firstLine="0"/>
+              <w:jc w:val="center"/>
+            </w:pPr>
+            <w:r>
+              <w:rPr>
+                <w:rFonts w:ascii="Times New Roman" w:hAnsi="Times New Roman"/>
+                <w:sz w:val="19"/>
+              </w:rPr>
+              <w:t>Сетевые события и доступность NRF</w:t>
+            </w:r>
+          </w:p>
+        </w:tc>
+        <w:tc>
+          <w:tcPr>
+            <w:tcW w:type="dxa" w:w="2367"/>
+            <w:vAlign w:val="center"/>
+            <w:tcBorders>
+              <w:top w:val="single" w:sz="5" w:color="CCD3DD"/>
+              <w:left w:val="single" w:sz="5" w:color="CCD3DD"/>
+              <w:bottom w:val="single" w:sz="5" w:color="CCD3DD"/>
+              <w:right w:val="single" w:sz="5" w:color="CCD3DD"/>
+            </w:tcBorders>
+          </w:tcPr>
+          <w:p>
+            <w:pPr>
+              <w:spacing w:after="40" w:before="40"/>
+              <w:ind w:firstLine="0"/>
+              <w:jc w:val="center"/>
+            </w:pPr>
+            <w:r>
+              <w:rPr>
+                <w:rFonts w:ascii="Times New Roman" w:hAnsi="Times New Roman"/>
+                <w:sz w:val="19"/>
+              </w:rPr>
+              <w:t>Не устанавливает совпадение с подписанным отчетом</w:t>
+            </w:r>
+          </w:p>
+        </w:tc>
+      </w:tr>
+      <w:tr>
+        <w:tc>
+          <w:tcPr>
+            <w:tcW w:type="dxa" w:w="2367"/>
+            <w:vAlign w:val="center"/>
+            <w:tcBorders>
+              <w:top w:val="single" w:sz="5" w:color="CCD3DD"/>
+              <w:left w:val="single" w:sz="5" w:color="CCD3DD"/>
+              <w:bottom w:val="single" w:sz="5" w:color="CCD3DD"/>
+              <w:right w:val="single" w:sz="5" w:color="CCD3DD"/>
+            </w:tcBorders>
+          </w:tcPr>
+          <w:p>
+            <w:pPr>
+              <w:spacing w:after="40" w:before="40"/>
+              <w:ind w:firstLine="0"/>
+              <w:jc w:val="left"/>
+            </w:pPr>
+            <w:r>
+              <w:rPr>
+                <w:rFonts w:ascii="Times New Roman" w:hAnsi="Times New Roman"/>
+                <w:sz w:val="19"/>
+              </w:rPr>
+              <w:t>Контекстное тестирование 5GC</w:t>
+            </w:r>
+          </w:p>
+        </w:tc>
+        <w:tc>
+          <w:tcPr>
+            <w:tcW w:type="dxa" w:w="2367"/>
+            <w:vAlign w:val="center"/>
+            <w:tcBorders>
+              <w:top w:val="single" w:sz="5" w:color="CCD3DD"/>
+              <w:left w:val="single" w:sz="5" w:color="CCD3DD"/>
+              <w:bottom w:val="single" w:sz="5" w:color="CCD3DD"/>
+              <w:right w:val="single" w:sz="5" w:color="CCD3DD"/>
+            </w:tcBorders>
+          </w:tcPr>
+          <w:p>
+            <w:pPr>
+              <w:spacing w:after="40" w:before="40"/>
+              <w:ind w:firstLine="0"/>
+              <w:jc w:val="center"/>
+            </w:pPr>
+            <w:r>
+              <w:rPr>
+                <w:rFonts w:ascii="Times New Roman" w:hAnsi="Times New Roman"/>
+                <w:sz w:val="19"/>
+              </w:rPr>
+              <w:t>CoreCrisis [33]</w:t>
+            </w:r>
+          </w:p>
+        </w:tc>
+        <w:tc>
+          <w:tcPr>
+            <w:tcW w:type="dxa" w:w="2367"/>
+            <w:vAlign w:val="center"/>
+            <w:tcBorders>
+              <w:top w:val="single" w:sz="5" w:color="CCD3DD"/>
+              <w:left w:val="single" w:sz="5" w:color="CCD3DD"/>
+              <w:bottom w:val="single" w:sz="5" w:color="CCD3DD"/>
+              <w:right w:val="single" w:sz="5" w:color="CCD3DD"/>
+            </w:tcBorders>
+          </w:tcPr>
+          <w:p>
+            <w:pPr>
+              <w:spacing w:after="40" w:before="40"/>
+              <w:ind w:firstLine="0"/>
+              <w:jc w:val="center"/>
+            </w:pPr>
+            <w:r>
+              <w:rPr>
+                <w:rFonts w:ascii="Times New Roman" w:hAnsi="Times New Roman"/>
+                <w:sz w:val="19"/>
+              </w:rPr>
+              <w:t>Последовательность протокольных ответов</w:t>
+            </w:r>
+          </w:p>
+        </w:tc>
+        <w:tc>
+          <w:tcPr>
+            <w:tcW w:type="dxa" w:w="2367"/>
+            <w:vAlign w:val="center"/>
+            <w:tcBorders>
+              <w:top w:val="single" w:sz="5" w:color="CCD3DD"/>
+              <w:left w:val="single" w:sz="5" w:color="CCD3DD"/>
+              <w:bottom w:val="single" w:sz="5" w:color="CCD3DD"/>
+              <w:right w:val="single" w:sz="5" w:color="CCD3DD"/>
+            </w:tcBorders>
+          </w:tcPr>
+          <w:p>
+            <w:pPr>
+              <w:spacing w:after="40" w:before="40"/>
+              <w:ind w:firstLine="0"/>
+              <w:jc w:val="center"/>
+            </w:pPr>
+            <w:r>
+              <w:rPr>
+                <w:rFonts w:ascii="Times New Roman" w:hAnsi="Times New Roman"/>
+                <w:sz w:val="19"/>
+              </w:rPr>
+              <w:t>Не является проверкой дискретной телеметрии</w:t>
+            </w:r>
+          </w:p>
+        </w:tc>
+      </w:tr>
+      <w:tr>
+        <w:tc>
+          <w:tcPr>
+            <w:tcW w:type="dxa" w:w="2367"/>
+            <w:vAlign w:val="center"/>
+            <w:tcBorders>
+              <w:top w:val="single" w:sz="5" w:color="CCD3DD"/>
+              <w:left w:val="single" w:sz="5" w:color="CCD3DD"/>
+              <w:bottom w:val="single" w:sz="5" w:color="CCD3DD"/>
+              <w:right w:val="single" w:sz="5" w:color="CCD3DD"/>
+            </w:tcBorders>
+          </w:tcPr>
+          <w:p>
+            <w:pPr>
+              <w:spacing w:after="40" w:before="40"/>
+              <w:ind w:firstLine="0"/>
+              <w:jc w:val="left"/>
+            </w:pPr>
+            <w:r>
+              <w:rPr>
+                <w:rFonts w:ascii="Times New Roman" w:hAnsi="Times New Roman"/>
+                <w:sz w:val="19"/>
+              </w:rPr>
+              <w:t>Гибкие временные окна</w:t>
+            </w:r>
+          </w:p>
+        </w:tc>
+        <w:tc>
+          <w:tcPr>
+            <w:tcW w:type="dxa" w:w="2367"/>
+            <w:vAlign w:val="center"/>
+            <w:tcBorders>
+              <w:top w:val="single" w:sz="5" w:color="CCD3DD"/>
+              <w:left w:val="single" w:sz="5" w:color="CCD3DD"/>
+              <w:bottom w:val="single" w:sz="5" w:color="CCD3DD"/>
+              <w:right w:val="single" w:sz="5" w:color="CCD3DD"/>
+            </w:tcBorders>
+          </w:tcPr>
+          <w:p>
+            <w:pPr>
+              <w:spacing w:after="40" w:before="40"/>
+              <w:ind w:firstLine="0"/>
+              <w:jc w:val="center"/>
+            </w:pPr>
+            <w:r>
+              <w:rPr>
+                <w:rFonts w:ascii="Times New Roman" w:hAnsi="Times New Roman"/>
+                <w:sz w:val="19"/>
+              </w:rPr>
+              <w:t>Bifet, Gavaldà [40]; AdaptWin [41]</w:t>
+            </w:r>
+          </w:p>
+        </w:tc>
+        <w:tc>
+          <w:tcPr>
+            <w:tcW w:type="dxa" w:w="2367"/>
+            <w:vAlign w:val="center"/>
+            <w:tcBorders>
+              <w:top w:val="single" w:sz="5" w:color="CCD3DD"/>
+              <w:left w:val="single" w:sz="5" w:color="CCD3DD"/>
+              <w:bottom w:val="single" w:sz="5" w:color="CCD3DD"/>
+              <w:right w:val="single" w:sz="5" w:color="CCD3DD"/>
+            </w:tcBorders>
+          </w:tcPr>
+          <w:p>
+            <w:pPr>
+              <w:spacing w:after="40" w:before="40"/>
+              <w:ind w:firstLine="0"/>
+              <w:jc w:val="center"/>
+            </w:pPr>
+            <w:r>
+              <w:rPr>
+                <w:rFonts w:ascii="Times New Roman" w:hAnsi="Times New Roman"/>
+                <w:sz w:val="19"/>
+              </w:rPr>
+              <w:t>Временные ряды</w:t>
+            </w:r>
+          </w:p>
+        </w:tc>
+        <w:tc>
+          <w:tcPr>
+            <w:tcW w:type="dxa" w:w="2367"/>
+            <w:vAlign w:val="center"/>
+            <w:tcBorders>
+              <w:top w:val="single" w:sz="5" w:color="CCD3DD"/>
+              <w:left w:val="single" w:sz="5" w:color="CCD3DD"/>
+              <w:bottom w:val="single" w:sz="5" w:color="CCD3DD"/>
+              <w:right w:val="single" w:sz="5" w:color="CCD3DD"/>
+            </w:tcBorders>
+          </w:tcPr>
+          <w:p>
+            <w:pPr>
+              <w:spacing w:after="40" w:before="40"/>
+              <w:ind w:firstLine="0"/>
+              <w:jc w:val="center"/>
+            </w:pPr>
+            <w:r>
+              <w:rPr>
+                <w:rFonts w:ascii="Times New Roman" w:hAnsi="Times New Roman"/>
+                <w:sz w:val="19"/>
+              </w:rPr>
+              <w:t>Требуется привязка окна к физическому событию</w:t>
+            </w:r>
+          </w:p>
+        </w:tc>
+      </w:tr>
+      <w:tr>
+        <w:tc>
+          <w:tcPr>
+            <w:tcW w:type="dxa" w:w="2367"/>
+            <w:vAlign w:val="center"/>
+            <w:tcBorders>
+              <w:top w:val="single" w:sz="5" w:color="CCD3DD"/>
+              <w:left w:val="single" w:sz="5" w:color="CCD3DD"/>
+              <w:bottom w:val="single" w:sz="5" w:color="CCD3DD"/>
+              <w:right w:val="single" w:sz="5" w:color="CCD3DD"/>
+            </w:tcBorders>
+          </w:tcPr>
+          <w:p>
+            <w:pPr>
+              <w:spacing w:after="40" w:before="40"/>
+              <w:ind w:firstLine="0"/>
+              <w:jc w:val="left"/>
+            </w:pPr>
+            <w:r>
+              <w:rPr>
+                <w:rFonts w:ascii="Times New Roman" w:hAnsi="Times New Roman"/>
+                <w:sz w:val="19"/>
+              </w:rPr>
+              <w:t>Настоящее исследование [42]</w:t>
+            </w:r>
+          </w:p>
+        </w:tc>
+        <w:tc>
+          <w:tcPr>
+            <w:tcW w:type="dxa" w:w="2367"/>
+            <w:vAlign w:val="center"/>
+            <w:tcBorders>
+              <w:top w:val="single" w:sz="5" w:color="CCD3DD"/>
+              <w:left w:val="single" w:sz="5" w:color="CCD3DD"/>
+              <w:bottom w:val="single" w:sz="5" w:color="CCD3DD"/>
+              <w:right w:val="single" w:sz="5" w:color="CCD3DD"/>
+            </w:tcBorders>
+          </w:tcPr>
+          <w:p>
+            <w:pPr>
+              <w:spacing w:after="40" w:before="40"/>
+              <w:ind w:firstLine="0"/>
+              <w:jc w:val="center"/>
+            </w:pPr>
+            <w:r>
+              <w:rPr>
+                <w:rFonts w:ascii="Times New Roman" w:hAnsi="Times New Roman"/>
+                <w:sz w:val="19"/>
+              </w:rPr>
+              <w:t>Open5GS; KIE v1/v2</w:t>
+            </w:r>
+          </w:p>
+        </w:tc>
+        <w:tc>
+          <w:tcPr>
+            <w:tcW w:type="dxa" w:w="2367"/>
+            <w:vAlign w:val="center"/>
+            <w:tcBorders>
+              <w:top w:val="single" w:sz="5" w:color="CCD3DD"/>
+              <w:left w:val="single" w:sz="5" w:color="CCD3DD"/>
+              <w:bottom w:val="single" w:sz="5" w:color="CCD3DD"/>
+              <w:right w:val="single" w:sz="5" w:color="CCD3DD"/>
+            </w:tcBorders>
+          </w:tcPr>
+          <w:p>
+            <w:pPr>
+              <w:spacing w:after="40" w:before="40"/>
+              <w:ind w:firstLine="0"/>
+              <w:jc w:val="center"/>
+            </w:pPr>
+            <w:r>
+              <w:rPr>
+                <w:rFonts w:ascii="Times New Roman" w:hAnsi="Times New Roman"/>
+                <w:sz w:val="19"/>
+              </w:rPr>
+              <w:t>Пакеты HTTP/2 и HMAC-телеметрия</w:t>
+            </w:r>
+          </w:p>
+        </w:tc>
+        <w:tc>
+          <w:tcPr>
+            <w:tcW w:type="dxa" w:w="2367"/>
+            <w:vAlign w:val="center"/>
+            <w:tcBorders>
+              <w:top w:val="single" w:sz="5" w:color="CCD3DD"/>
+              <w:left w:val="single" w:sz="5" w:color="CCD3DD"/>
+              <w:bottom w:val="single" w:sz="5" w:color="CCD3DD"/>
+              <w:right w:val="single" w:sz="5" w:color="CCD3DD"/>
+            </w:tcBorders>
+          </w:tcPr>
+          <w:p>
+            <w:pPr>
+              <w:spacing w:after="40" w:before="40"/>
+              <w:ind w:firstLine="0"/>
+              <w:jc w:val="center"/>
+            </w:pPr>
+            <w:r>
+              <w:rPr>
+                <w:rFonts w:ascii="Times New Roman" w:hAnsi="Times New Roman"/>
+                <w:sz w:val="19"/>
+              </w:rPr>
+              <w:t>Общая VM, общий декодер и ограниченное число сред</w:t>
+            </w:r>
+          </w:p>
+        </w:tc>
+      </w:tr>
+    </w:tbl>
+    <w:p>
+      <w:pPr>
+        <w:spacing w:after="0"/>
+      </w:pPr>
+    </w:p>
+    <w:p>
+      <w:r>
+        <w:t>Из приведенного сопоставления следует, что наблюдение пакетов и контроль ресурсов выполняют взаимодополняющие функции. В рассмотренных работах не выявлена схема, полностью совпадающая с предлагаемым порядком: сначала независимо установить факт всплеска NRF по физическим HTTP/2-обращениям, затем проверить происхождение локального отчета и только после этого оценить его согласованность с событием. При этом отсутствие аналогичной схемы в рассмотренной выборке публикаций не следует трактовать как доказательство ее отсутствия во всей литературе.</w:t>
+      </w:r>
+    </w:p>
+    <w:p>
+      <w:r>
+        <w:rPr>
+          <w:b/>
+        </w:rPr>
+        <w:t>1.3. Криптографическая целостность и семантическая достоверность телеметрии.</w:t>
+      </w:r>
+      <w:r>
+        <w:t xml:space="preserve"> Аутентификация отчетов KIE основана на HMAC-SHA256. RFC 2104 описывает конструкцию HMAC, NIST FIPS 198-1 закрепляет ее стандартизованное применение, RFC 4231 приводит проверочные векторы, а FIPS 180-4 определяет семейство используемых хеш-функций [43–46]. В рамках предположения о сохранности ключа корректный HMAC подтверждает происхождение и неизменность сообщения. Он не подтверждает правильность показания CPU, наличие необнаруженных запросов или отсутствие компрометации подписывающего процесса. Отдельный механизм доверенного штампования времени предусмотрен RFC 3161 [47], однако в описанном эксперименте он не применялся.</w:t>
+      </w:r>
+    </w:p>
+    <w:p>
+      <w:r>
+        <w:t>С практической точки зрения следует различать три состояния: достоверный внешний всплеск и подтвержденный локальный отклик; достоверный всплеск и неподтвержденный отклик при наличии пригодных отчетов; отсутствие достаточных отчетов для вынесения решения. Последнее состояние обозначается как «неизвестно», а не как доказанное сокрытие. Это согласуется с общими принципами ведения журналов и непрерывного контроля [48–50], но не является удаленной аппаратной аттестацией сетевой функции.</w:t>
+      </w:r>
+    </w:p>
+    <w:p>
+      <w:r>
+        <w:rPr>
+          <w:b/>
+        </w:rPr>
+        <w:t>1.4. Временные окна и связь события с отчетом.</w:t>
+      </w:r>
+      <w:r>
+        <w:t xml:space="preserve"> Для коротких сигнальных воздействий существенное значение имеет взаимное положение события, окна пакетного наблюдения и момента опроса процесса. Модель скользящего окна формализована Datar и соавторами [51], а Bifet и Gavaldà показали преимущества адаптации окна при изменении свойств потока [40]. В сетевом мониторинге динамические признаки используются, в частности, в Kitsune [52]. Исследование гибкого выравнивания временных сигналов AdaptWin указывает на ограничения фиксированных окон при асинхронных наблюдениях [41]. Следовательно, решение об отсутствии подтверждения должно учитывать не только величину порога, но и допустимый интервал задержки между двумя каналами.</w:t>
+      </w:r>
+    </w:p>
+    <w:p>
+      <w:r>
+        <w:t>Пусть физический всплеск содержит N запросов и имеет продолжительность d менее ширины неподвижного окна W. При расположении события на границе соседних интервалов его запросы могут разделиться на части N₁ и N₂. Если выполняется неравенство</w:t>
+      </w:r>
+    </w:p>
+    <w:p>
+      <w:pPr>
+        <w:spacing w:before="120" w:after="180"/>
+        <w:ind w:firstLine="0"/>
+        <w:jc w:val="center"/>
+      </w:pPr>
+      <w:r>
+        <w:rPr>
+          <w:i/>
+          <w:sz w:val="22"/>
+        </w:rPr>
+        <w:t>max(N₁, N₂) &lt; H ≤ N₁ + N₂,</w:t>
+      </w:r>
+    </w:p>
+    <w:p>
+      <w:r>
+        <w:t>где H — порог обнаружения, один и тот же всплеск не проходит проверку в двух неподвижных интервалах, хотя проходит ее при корректном скользящем окне. Этот эффект относится к процедуре регистрации события и не должен ошибочно приписываться качеству телеметрического детектора. В настоящем эксперименте он проверен путем повторной обработки неизмененных пакетных архивов с привязкой начала события к первому GET, а не к центру двухсекундной ячейки [42].</w:t>
+      </w:r>
+    </w:p>
+    <w:p>
+      <w:r>
+        <w:t>Отдельная временная ошибка возникает при сравнении внешнего события с дискретной телеметрией. В предшествующем испытании KIE v1 положительный CPU-отсчет был получен через 3,177 с после начала события и не попал в трехсекундный горизонт подтверждения; увеличение горизонта до 4 с в KIE v2 устранило данный граничный случай [42]. Однако это наблюдение не доказывает универсального превосходства v2: более длинное окно может включать постороннюю активность, а период опроса 4 с может вообще не обеспечить маскированного отсчета внутри короткого вмешательства.</w:t>
+      </w:r>
+    </w:p>
+    <w:p>
+      <w:r>
+        <w:rPr>
+          <w:b/>
+        </w:rPr>
+        <w:t>1.5. Воспроизводимость и оценка качества.</w:t>
+      </w:r>
+      <w:r>
+        <w:t xml:space="preserve"> Методологически необходимо различать повторный анализ одной пакетной записи, новый запуск на независимой виртуальной среде и внешнее воспроизведение другой исследовательской группой. В настоящей работе реализованы первые два уровня; третий не заявляется. Критерии доступности, работоспособности и воспроизводимости исследовательских артефактов рассматриваются в практике USENIX Security [53]. Для анализа редких ложных обвинений также необходимо учитывать несбалансированность классов: соотношение ROC и Precision–Recall показано Davis и Goadrich [54]. Парные сравнения и множественная проверка гипотез могут опираться на методы Wilcoxon и Holm [55, 56], однако при небольшом числе независимых сред их применение не заменяет увеличения числа развертываний.</w:t>
+      </w:r>
+    </w:p>
+    <w:p>
+      <w:r>
+        <w:t>Связь рассматриваемой задачи с отечественными исследованиями сигнальных сетей прослеживается в работах по рискам DoS для ОКС-7 и NGN [1, 2]. В них особое значение придается достоверности наблюдения и границам переноса результатов испытаний в действующую сеть. Для 5G Core этот вопрос дополняется необходимостью сопоставлять прикладной HTTP/2-трафик с подписанными, но потенциально дискретными и неполными отчетами самой NF.</w:t>
+      </w:r>
+    </w:p>
+    <w:p>
+      <w:r>
+        <w:t>Таким образом, исследовательская задача состоит в разделении ошибок трех уровней: регистрации внешнего события, криптографического и временного контроля локальной телеметрии, интерпретации полученного расхождения. Экспериментальные метки «скрытый» и «правдивый» присоединяются после получения решения KIE. На этом основании ниже задаются формальное определение события, правила сравнения каналов и протокол проверки на новых средах Open5GS.</w:t>
       </w:r>
     </w:p>
     <w:p>
@@ -200,7 +1087,7 @@
     </w:p>
     <w:p>
       <w:r>
-        <w:t>Второй канал содержит отчеты KIE о состоянии NRF. Для каждого отчета предусмотрены идентификатор функции, номер последовательности, временная метка, данные о процессе и приращение процессорных тиков; целостность и подлинность проверяются по HMAC. Использование HMAC соответствует общему принципу криптографической аутентификации сообщения [13], тогда как требования к регистрации и прослеживаемости событий обсуждаются в руководствах по журналированию и непрерывному контролю [15, 16]. Наличие валидной подписи не заменяет проверку совпадения отчетов с исходной записью коллектора.</w:t>
+        <w:t>Второй канал содержит отчеты KIE о состоянии NRF. Для каждого отчета предусмотрены идентификатор функции, номер последовательности, временная метка, данные о процессе и приращение процессорных тиков; целостность и подлинность проверяются по HMAC. Использование HMAC соответствует общему принципу криптографической аутентификации сообщения [43], тогда как требования к регистрации и прослеживаемости событий обсуждаются в руководствах по журналированию и непрерывному контролю [48, 49]. Наличие валидной подписи не заменяет проверку совпадения отчетов с исходной записью коллектора.</w:t>
       </w:r>
     </w:p>
     <w:p>
@@ -291,7 +1178,7 @@
     </w:p>
     <w:p>
       <w:r>
-        <w:t>Исследование выполнено на открытой реализации Open5GS [31] с использованием действующих процессов ядра и обмена HTTP/2 с NRF. Трафик генерировался как серия реальных запросов к интерфейсу обнаружения сетевых функций. Рассматривались два профиля: короткий всплеск из 30 GET-запросов и стандартный из 60 GET-запросов. Вмешательство имело два состояния: правдивое отображение измеряемого отклика и управляемое сокрытие отклика в отчетах KIE. Последнее представляет собой лабораторную неисправность телеметрии, а не воспроизведение компрометации промышленной сетевой функции.</w:t>
+        <w:t>Исследование выполнено на открытой реализации Open5GS [24] с использованием действующих процессов ядра и обмена HTTP/2 с NRF. Трафик генерировался как серия реальных запросов к интерфейсу обнаружения сетевых функций. Рассматривались два профиля: короткий всплеск из 30 GET-запросов и стандартный из 60 GET-запросов. Вмешательство имело два состояния: правдивое отображение измеряемого отклика и управляемое сокрытие отклика в отчетах KIE. Последнее представляет собой лабораторную неисправность телеметрии, а не воспроизведение компрометации промышленной сетевой функции.</w:t>
       </w:r>
     </w:p>
     <w:p>
@@ -306,7 +1193,7 @@
     </w:p>
     <w:p>
       <w:r>
-        <w:t>Пакетное наблюдение выполнялось двумя одновременно работающими процессами: tcpdump сохранял PCAP, tshark — отдельный PCAPNG. Оба процесса наблюдали один интерфейс loopback той же виртуальной машины. Первичная обработка первого архива и повторная обработка второго использовали разные программы разбора результатов, но общий декодер HTTP/2 tshark [32, 33]. Поэтому под «двумя наблюдателями» далее понимаются независимые процессы захвата и отдельные пути обработки, а не физически разделенные измерительные пункты.</w:t>
+        <w:t>Пакетное наблюдение выполнялось двумя одновременно работающими процессами: tcpdump сохранял PCAP, tshark — отдельный PCAPNG. Оба процесса наблюдали один интерфейс loopback той же виртуальной машины. Первичная обработка первого архива и повторная обработка второго использовали разные программы разбора результатов, но общий декодер HTTP/2 tshark [19–21, 57]. Поэтому под «двумя наблюдателями» далее понимаются независимые процессы захвата и отдельные пути обработки, а не физически разделенные измерительные пункты.</w:t>
       </w:r>
     </w:p>
     <w:p>
@@ -397,7 +1284,7 @@
         <w:rPr>
           <w:b/>
         </w:rPr>
-        <w:t>Таблица 1 — Результаты повторной оценки коротких всплесков в исходной серии (12 сред, Ubuntu 22.04)</w:t>
+        <w:t>Таблица 2 — Результаты повторной оценки коротких всплесков в исходной серии (12 сред, Ubuntu 22.04)</w:t>
       </w:r>
     </w:p>
     <w:tbl>
@@ -1111,7 +1998,7 @@
         <w:rPr>
           <w:b/>
         </w:rPr>
-        <w:t>Таблица 2 — Решения KIE для коротких всплесков в проспективной серии (6 сред, Ubuntu 24.04)</w:t>
+        <w:t>Таблица 3 — Решения KIE для коротких всплесков в проспективной серии (6 сред, Ubuntu 24.04)</w:t>
       </w:r>
     </w:p>
     <w:tbl>
@@ -1858,7 +2745,7 @@
     </w:p>
     <w:p>
       <w:r>
-        <w:t>Третий источник связан с достоверностью подписанной телеметрии. HMAC защищает сообщение от незаметного изменения при сохранности ключа, однако скомпрометированный измеритель способен подписать неверное значение. По этой причине пакетная запись рассматривается как отдельный источник свидетельств, а целостность, полнота и семантическая правильность отчетов оцениваются раздельно. Подход соответствует общим требованиям к регистрации и анализу инцидентов [15–17], но не реализует универсальную систему доверенной аттестации состояния сетевой функции.</w:t>
+        <w:t>Третий источник связан с достоверностью подписанной телеметрии. HMAC защищает сообщение от незаметного изменения при сохранности ключа, однако скомпрометированный измеритель способен подписать неверное значение. По этой причине пакетная запись рассматривается как отдельный источник свидетельств, а целостность, полнота и семантическая правильность отчетов оцениваются раздельно. Подход соответствует общим требованиям к регистрации и анализу инцидентов [48–50], но не реализует универсальную систему доверенной аттестации состояния сетевой функции.</w:t>
       </w:r>
     </w:p>
     <w:p>
@@ -1868,12 +2755,22 @@
     </w:p>
     <w:p>
       <w:r>
-        <w:t>Наконец, эксперимент проводился с контролируемым потоком запросов и локальным сокрытием отчетов, а не с реальным нарушителем, владеющим сетевой функцией. Производственная SBA может использовать TLS, сервисные прокси, распределенные экземпляры NRF и иные условия наблюдения [6, 9]. В защищенном канале пассивный наблюдатель без разрешенного доступа к расшифрованным метаданным не сможет непосредственно восстановить HTTP/2-метод и путь запроса. Следовательно, перенос предложенной схемы требует определения допустимой точки наблюдения и отдельной оценки нагрузки, потерь, рассинхронизации часов и доверия к источникам.</w:t>
+        <w:t>Наконец, эксперимент проводился с контролируемым потоком запросов и локальным сокрытием отчетов, а не с реальным нарушителем, владеющим сетевой функцией. Производственная SBA может использовать TLS, сервисные прокси, распределенные экземпляры NRF и иные условия наблюдения [8, 13]. В защищенном канале пассивный наблюдатель без разрешенного доступа к расшифрованным метаданным не сможет непосредственно восстановить HTTP/2-метод и путь запроса. Следовательно, перенос предложенной схемы требует определения допустимой точки наблюдения и отдельной оценки нагрузки, потерь, рассинхронизации часов и доверия к источникам.</w:t>
       </w:r>
     </w:p>
     <w:p>
       <w:r>
         <w:t>Перспективным продолжением является испытание на физически разнесенных наблюдателях с независимыми реализациями декодирования, проверка нескольких версий Open5GS и иных реализаций 5G Core, расширение набора фоновых нагрузок и переход от описательных долей к анализу по независимым развертываниям. Для сопоставления с действующей сетью необходимы согласованные критерии качества обнаружения и процедура сохранения пакетных доказательств.</w:t>
+      </w:r>
+    </w:p>
+    <w:p>
+      <w:r>
+        <w:t>Сопоставление экспериментальных наблюдений с исследованиями скользящих окон показывает, что ошибка фиксированной временной сетки должна рассматриваться отдельно от ошибок телеметрии [40, 41, 51]. Для исходной серии исправление пакетного свидетеля увеличило число установленных событий с 129 до 144, но не изменило правила KIE. Это принципиально иной эффект, чем изменение горизонта подтверждения в v2. В частности, известный из предварительных испытаний граничный случай с первым положительным CPU-отсчетом через 3,177 с объясняет необходимость исследования задержки опроса, но не служит основанием для переноса результатов ранней трехсредовой серии на 18 новых виртуальных развертываний [42]. Последние представлены в настоящей статье отдельно: 12 сред исходной серии и 6 сред проспективной проверки.</w:t>
+      </w:r>
+    </w:p>
+    <w:p>
+      <w:r>
+        <w:t>Возможная количественная оценка ошибок должна учитывать зависимость повторов внутри одной среды. Наблюдения 18/18 в отдельном раннем тесте либо 0/24 сетевых ложных событий в контрольных окнах не означают гарантированную полноту или нулевую вероятность ошибки при эксплуатации. Для будущих серий целесообразны заранее заданные показатели event-level recall, false-accusation rate, доля решений «неизвестно», потери пакетного наблюдателя и задержка первой тревоги. При сравнении нескольких режимов следует учитывать структуру связанных наблюдений, применять интервальные оценки и при необходимости корректировать множественные проверки [54–56]. Первичной единицей обобщения должна оставаться независимо подготовленная среда, а не отдельное перекрывающееся окно.</w:t>
       </w:r>
     </w:p>
     <w:p>
@@ -1909,7 +2806,7 @@
     </w:p>
     <w:p>
       <w:r>
-        <w:t>Протоколы, исходный код, тесты и журналы выполнения размещены в репозитории: https://github.com/verge88/signal_network_sim. Проспективная проверка: https://github.com/verge88/signal_network_sim/actions/runs/37941500023; сводный архив: https://github.com/verge88/signal_network_sim/actions/runs/37941500023/artifacts/11622038501; экспериментальная ветвь и материалы: https://github.com/verge88/signal_network_sim/pull/15. Исторический пересчет: https://github.com/verge88/signal_network_sim/actions/runs/37937002087. Архивы GitHub Actions имеют ограниченный срок хранения, поэтому для публикации необходима долговременная копия исходных свидетельств. В настоящем тексте KIE v1/v2 рассматривается исключительно как исследовательская реализация.</w:t>
+        <w:t>Протоколы, исходный код, тесты и журналы выполнения размещены в репозитории: https://github.com/verge88/signal_network_sim. Проспективная проверка: https://github.com/verge88/signal_network_sim/actions/runs/37941500023; сводный архив: https://github.com/verge88/signal_network_sim/actions/runs/37941500023/artifacts/11622038501; экспериментальная ветвь и материалы: https://github.com/verge88/signal_network_sim/pull/15. Исторический пересчет: https://github.com/verge88/signal_network_sim/actions/runs/37937002087. Архивы GitHub Actions имеют ограниченный срок хранения, поэтому для публикации необходима долговременная копия исходных свидетельств. В настоящем тексте KIE v1/v2 рассматривается исключительно как исследовательская реализация. Данные ранее проведенных предварительных серий и новые результаты не объединяются в единую статистическую выборку. Порядок публикации и проверки исследовательских артефактов соотнесен с требованиями воспроизводимости [53].</w:t>
       </w:r>
     </w:p>
     <w:p>
@@ -1934,7 +2831,7 @@
         <w:rPr>
           <w:sz w:val="18"/>
         </w:rPr>
-        <w:t>1. 3GPP. TS 23.501. System Architecture for the 5G System (5GS). URL: https://www.3gpp.org/ftp/Specs/archive/23_series/23.501/ (дата обращения: 09.10.2026).</w:t>
+        <w:t>1. Матвеев В. А., Бельфер Р. А., Глинская Е. В. Оценка уровня риска безопасности атаки DoS-функций маршрутизации системы сигнализации ОКС-7 в сети GSM // Вестник МГТУ им. Н. Э. Баумана. Сер. Приборостроение. 2015. № 4. С. 127–138. DOI: 10.18698/0236-3933-2015-4-127-138.</w:t>
       </w:r>
     </w:p>
     <w:p>
@@ -1946,7 +2843,7 @@
         <w:rPr>
           <w:sz w:val="18"/>
         </w:rPr>
-        <w:t>2. 3GPP. TS 23.502. Procedures for the 5G System (5GS). URL: https://www.3gpp.org/ftp/Specs/archive/23_series/23.502/ (дата обращения: 09.10.2026).</w:t>
+        <w:t>2. Матвеев В. А., Морозов А. М. Анализ результатов испытаний действующей сети нового поколения NGN на уязвимость к атакам DoS // Вестник МГТУ им. Н. Э. Баумана. Сер. Приборостроение. 2013. № 3. С. 43–57.</w:t>
       </w:r>
     </w:p>
     <w:p>
@@ -1958,7 +2855,7 @@
         <w:rPr>
           <w:sz w:val="18"/>
         </w:rPr>
-        <w:t>3. 3GPP. TS 29.500. 5G System; Technical Realization of Service Based Architecture; Stage 3. URL: https://www.3gpp.org/ftp/Specs/archive/29_series/29.500/ (дата обращения: 09.10.2026).</w:t>
+        <w:t>3. 3GPP. TS 23.501. System Architecture for the 5G System (5GS). URL: https://www.3gpp.org/ftp/Specs/archive/23_series/23.501/ (дата обращения: 09.10.2026).</w:t>
       </w:r>
     </w:p>
     <w:p>
@@ -1970,7 +2867,7 @@
         <w:rPr>
           <w:sz w:val="18"/>
         </w:rPr>
-        <w:t>4. 3GPP. TS 29.501. 5G System; Principles and Guidelines for Services Definition; Stage 3. URL: https://www.3gpp.org/ftp/Specs/archive/29_series/29.501/ (дата обращения: 09.10.2026).</w:t>
+        <w:t>4. 3GPP. TS 23.502. Procedures for the 5G System (5GS). URL: https://www.3gpp.org/ftp/Specs/archive/23_series/23.502/ (дата обращения: 09.10.2026).</w:t>
       </w:r>
     </w:p>
     <w:p>
@@ -1982,7 +2879,7 @@
         <w:rPr>
           <w:sz w:val="18"/>
         </w:rPr>
-        <w:t>5. 3GPP. TS 29.510. 5G System; Network Function Repository Services; Stage 3. URL: https://www.3gpp.org/ftp/Specs/archive/29_series/29.510/ (дата обращения: 09.10.2026).</w:t>
+        <w:t>5. 3GPP. TS 29.500. 5G System; Technical Realization of Service Based Architecture; Stage 3. URL: https://www.3gpp.org/ftp/Specs/archive/29_series/29.500/ (дата обращения: 09.10.2026).</w:t>
       </w:r>
     </w:p>
     <w:p>
@@ -1994,7 +2891,7 @@
         <w:rPr>
           <w:sz w:val="18"/>
         </w:rPr>
-        <w:t>6. 3GPP. TS 33.501. Security Architecture and Procedures for 5G System. URL: https://www.3gpp.org/ftp/Specs/archive/33_series/33.501/ (дата обращения: 09.10.2026).</w:t>
+        <w:t>6. 3GPP. TS 29.501. 5G System; Principles and Guidelines for Services Definition; Stage 3. URL: https://www.3gpp.org/ftp/Specs/archive/29_series/29.501/ (дата обращения: 09.10.2026).</w:t>
       </w:r>
     </w:p>
     <w:p>
@@ -2006,7 +2903,7 @@
         <w:rPr>
           <w:sz w:val="18"/>
         </w:rPr>
-        <w:t>7. Thomson M., Benfield C. HTTP/2. RFC 9113. IETF, 2022. DOI: 10.17487/RFC9113.</w:t>
+        <w:t>7. 3GPP. TS 29.510. 5G System; Network Function Repository Services; Stage 3. URL: https://www.3gpp.org/ftp/Specs/archive/29_series/29.510/ (дата обращения: 09.10.2026).</w:t>
       </w:r>
     </w:p>
     <w:p>
@@ -2018,7 +2915,7 @@
         <w:rPr>
           <w:sz w:val="18"/>
         </w:rPr>
-        <w:t>8. Fielding R., Nottingham M., Reschke J. HTTP Semantics. RFC 9110. IETF, 2022. DOI: 10.17487/RFC9110.</w:t>
+        <w:t>8. 3GPP. TS 33.501. Security Architecture and Procedures for 5G System. URL: https://www.3gpp.org/ftp/Specs/archive/33_series/33.501/ (дата обращения: 09.10.2026).</w:t>
       </w:r>
     </w:p>
     <w:p>
@@ -2030,7 +2927,7 @@
         <w:rPr>
           <w:sz w:val="18"/>
         </w:rPr>
-        <w:t>9. Rescorla E. The Transport Layer Security (TLS) Protocol Version 1.3. RFC 8446. IETF, 2018. DOI: 10.17487/RFC8446.</w:t>
+        <w:t>9. Thomson M., Benfield C. HTTP/2. RFC 9113. IETF, 2022. DOI: 10.17487/RFC9113.</w:t>
       </w:r>
     </w:p>
     <w:p>
@@ -2042,7 +2939,7 @@
         <w:rPr>
           <w:sz w:val="18"/>
         </w:rPr>
-        <w:t>10. Hardt D. The OAuth 2.0 Authorization Framework. RFC 6749. IETF, 2012. DOI: 10.17487/RFC6749.</w:t>
+        <w:t>10. Fielding R., Nottingham M., Reschke J. HTTP Semantics. RFC 9110. IETF, 2022. DOI: 10.17487/RFC9110.</w:t>
       </w:r>
     </w:p>
     <w:p>
@@ -2054,7 +2951,7 @@
         <w:rPr>
           <w:sz w:val="18"/>
         </w:rPr>
-        <w:t>11. Bertocci V. JSON Web Token (JWT) Profile for OAuth 2.0 Access Tokens. RFC 9068. IETF, 2021. DOI: 10.17487/RFC9068.</w:t>
+        <w:t>11. Wehbe N., Alameddine H. A., Pourzandi M., Bou-Harb E., Assi C. A Security Assessment of HTTP/2 Usage in 5G Service-Based Architecture // IEEE Communications Magazine. 2023. Vol. 61, no. 1. P. 48–54. DOI: 10.1109/MCOM.001.2200183.</w:t>
       </w:r>
     </w:p>
     <w:p>
@@ -2066,7 +2963,7 @@
         <w:rPr>
           <w:sz w:val="18"/>
         </w:rPr>
-        <w:t>12. Jones M., Bradley J., Sakimura N. JSON Web Signature (JWS). RFC 7515. IETF, 2015. DOI: 10.17487/RFC7515.</w:t>
+        <w:t>12. Wehbe N., Alameddine H. A., Pourzandi M., Assi C. 5GShield: HTTP/2 Anomaly Detection in 5G Service-Based Architecture // 2023 IFIP Networking Conference. 2023. P. 1–9. DOI: 10.23919/IFIPNetworking57963.2023.10186410.</w:t>
       </w:r>
     </w:p>
     <w:p>
@@ -2078,7 +2975,7 @@
         <w:rPr>
           <w:sz w:val="18"/>
         </w:rPr>
-        <w:t>13. Krawczyk H., Bellare M., Canetti R. HMAC: Keyed-Hashing for Message Authentication. RFC 2104. IETF, 1997. DOI: 10.17487/RFC2104.</w:t>
+        <w:t>13. Rescorla E. The Transport Layer Security (TLS) Protocol Version 1.3. RFC 8446. IETF, 2018. DOI: 10.17487/RFC8446.</w:t>
       </w:r>
     </w:p>
     <w:p>
@@ -2090,7 +2987,7 @@
         <w:rPr>
           <w:sz w:val="18"/>
         </w:rPr>
-        <w:t>14. Adams C., Cain P., Pinkas D., Zuccherato R. Internet X.509 Public Key Infrastructure Time-Stamp Protocol (TSP). RFC 3161. IETF, 2001. DOI: 10.17487/RFC3161.</w:t>
+        <w:t>14. Hardt D. The OAuth 2.0 Authorization Framework. RFC 6749. IETF, 2012. DOI: 10.17487/RFC6749.</w:t>
       </w:r>
     </w:p>
     <w:p>
@@ -2102,7 +2999,7 @@
         <w:rPr>
           <w:sz w:val="18"/>
         </w:rPr>
-        <w:t>15. Kent K., Souppaya M. Guide to Computer Security Log Management. NIST SP 800-92. NIST, 2006. DOI: 10.6028/NIST.SP.800-92.</w:t>
+        <w:t>15. Bertocci V. JSON Web Token (JWT) Profile for OAuth 2.0 Access Tokens. RFC 9068. IETF, 2021. DOI: 10.17487/RFC9068.</w:t>
       </w:r>
     </w:p>
     <w:p>
@@ -2114,7 +3011,7 @@
         <w:rPr>
           <w:sz w:val="18"/>
         </w:rPr>
-        <w:t>16. Dempsey K., Chawla N., Johnson A., Johnston R., Jones A. C., Orebaugh A., Scholl M., Stine K. Information Security Continuous Monitoring (ISCM) for Federal Information Systems and Organizations. NIST SP 800-137. NIST, 2011. DOI: 10.6028/NIST.SP.800-137.</w:t>
+        <w:t>16. Jones M., Bradley J., Sakimura N. JSON Web Signature (JWS). RFC 7515. IETF, 2015. DOI: 10.17487/RFC7515.</w:t>
       </w:r>
     </w:p>
     <w:p>
@@ -2126,7 +3023,7 @@
         <w:rPr>
           <w:sz w:val="18"/>
         </w:rPr>
-        <w:t>17. Cichonski P., Millar T., Grance T., Scarfone K. Computer Security Incident Handling Guide. NIST SP 800-61 Rev. 2. NIST, 2012. DOI: 10.6028/NIST.SP.800-61r2.</w:t>
+        <w:t>17. 3GPP. TS 28.552. Management and Orchestration; 5G Performance Measurements. URL: https://www.3gpp.org/ftp/Specs/archive/28_series/28.552/ (дата обращения: 10.10.2026).</w:t>
       </w:r>
     </w:p>
     <w:p>
@@ -2150,7 +3047,7 @@
         <w:rPr>
           <w:sz w:val="18"/>
         </w:rPr>
-        <w:t>19. Cao J., Ma M., Li H., Ma R., Sun Y., Yu P., Xiong L. A Survey on Security Aspects for 3GPP 5G Networks // IEEE Communications Surveys &amp; Tutorials. 2020. Vol. 22, no. 1. P. 170–195. DOI: 10.1109/COMST.2019.2951818.</w:t>
+        <w:t>19. Wireshark Foundation. Wireshark User's Guide. URL: https://www.wireshark.org/docs/wsug_html_chunked/ (дата обращения: 09.10.2026).</w:t>
       </w:r>
     </w:p>
     <w:p>
@@ -2162,7 +3059,7 @@
         <w:rPr>
           <w:sz w:val="18"/>
         </w:rPr>
-        <w:t>20. Tang Q., Ermis O., Nguyen C. D., De Oliveira A., Hirtzig A. A Systematic Analysis of 5G Networks With a Focus on 5G Core Security // IEEE Access. 2022. Vol. 10. P. 18298–18319. DOI: 10.1109/ACCESS.2022.3151000.</w:t>
+        <w:t>20. Wireshark Foundation. Display Filter Reference: HyperText Transfer Protocol 2. URL: https://www.wireshark.org/docs/dfref/h/http2.html (дата обращения: 10.10.2026).</w:t>
       </w:r>
     </w:p>
     <w:p>
@@ -2174,7 +3071,7 @@
         <w:rPr>
           <w:sz w:val="18"/>
         </w:rPr>
-        <w:t>21. Køien G. M. On Threats to the 5G Service Based Architecture // Wireless Personal Communications. 2021. Vol. 119. P. 97–116. DOI: 10.1007/s11277-021-08200-0.</w:t>
+        <w:t>21. Wireshark Foundation. TShark Manual. URL: https://www.wireshark.org/docs/man-pages/tshark.html (дата обращения: 10.10.2026).</w:t>
       </w:r>
     </w:p>
     <w:p>
@@ -2186,7 +3083,7 @@
         <w:rPr>
           <w:sz w:val="18"/>
         </w:rPr>
-        <w:t>22. Wehbe N., Alameddine H. A., Pourzandi M., Bou-Harb E., Assi C. A Security Assessment of HTTP/2 Usage in 5G Service-Based Architecture // IEEE Communications Magazine. 2023. Vol. 61, no. 1. P. 48–54. DOI: 10.1109/MCOM.001.2200183.</w:t>
+        <w:t>22. Dolente F., Garroppo R. G., Pagano M. A Vulnerability Assessment of Open-Source Implementations of Fifth-Generation Core Network Functions // Future Internet. 2024. Vol. 16, no. 1. Art. 1. DOI: 10.3390/fi16010001.</w:t>
       </w:r>
     </w:p>
     <w:p>
@@ -2198,7 +3095,7 @@
         <w:rPr>
           <w:sz w:val="18"/>
         </w:rPr>
-        <w:t>23. Wehbe N., Alameddine H. A., Pourzandi M., Assi C. 5GShield: HTTP/2 Anomaly Detection in 5G Service-Based Architecture // 2023 IFIP Networking Conference. 2023. P. 1–9. DOI: 10.23919/IFIPNetworking57963.2023.10186410.</w:t>
+        <w:t>23. Živković B., Čiča Z. Network Traffic Capturing in Open-Source 5G Core Network Platform // IcETRAN. 2023. DOI: 10.1109/IcETRAN59631.2023.10192225.</w:t>
       </w:r>
     </w:p>
     <w:p>
@@ -2210,7 +3107,7 @@
         <w:rPr>
           <w:sz w:val="18"/>
         </w:rPr>
-        <w:t>24. Dolente F., Garroppo R. G., Pagano M. A Vulnerability Assessment of Open-Source Implementations of Fifth-Generation Core Network Functions // Future Internet. 2024. Vol. 16, no. 1. Art. 1. DOI: 10.3390/fi16010001.</w:t>
+        <w:t>24. Open5GS Project. Open5GS: Open Source Implementation of 5G Core and EPC. URL: https://github.com/open5gs/open5gs (дата обращения: 09.10.2026).</w:t>
       </w:r>
     </w:p>
     <w:p>
@@ -2222,7 +3119,7 @@
         <w:rPr>
           <w:sz w:val="18"/>
         </w:rPr>
-        <w:t>25. Denning D. E. An Intrusion-Detection Model // IEEE Transactions on Software Engineering. 1987. Vol. SE-13, no. 2. P. 222–232. DOI: 10.1109/TSE.1987.232894.</w:t>
+        <w:t>25. Open5GS Project. Release Notes. URL: https://open5gs.org/open5gs/release/ (дата обращения: 10.10.2026).</w:t>
       </w:r>
     </w:p>
     <w:p>
@@ -2234,7 +3131,7 @@
         <w:rPr>
           <w:sz w:val="18"/>
         </w:rPr>
-        <w:t>26. Paxson V. Bro: A System for Detecting Network Intruders in Real-Time // Computer Networks. 1999. Vol. 31, no. 23–24. P. 2435–2463. DOI: 10.1016/S1389-1286(99)00112-7.</w:t>
+        <w:t>26. Zhang R., Lin Y., Chen S., Mo Z. A Multi-Node 5G Core Network Testbed Developed from Open5GS // ICCC. 2023. DOI: 10.1109/ICCC59590.2023.10507325.</w:t>
       </w:r>
     </w:p>
     <w:p>
@@ -2246,7 +3143,7 @@
         <w:rPr>
           <w:sz w:val="18"/>
         </w:rPr>
-        <w:t>27. Sommer R., Paxson V. Outside the Closed World: On Using Machine Learning for Network Intrusion Detection // 2010 IEEE Symposium on Security and Privacy. 2010. P. 305–316. DOI: 10.1109/SP.2010.25.</w:t>
+        <w:t>27. Lando G., Schierholt L. A. F., Milesi M. P., Wickboldt J. A. Evaluating the Performance of Open Source Software Implementations of the 5G Network Core // IEEE/IFIP NOMS. 2023. DOI: 10.1109/NOMS56928.2023.10154399.</w:t>
       </w:r>
     </w:p>
     <w:p>
@@ -2258,7 +3155,7 @@
         <w:rPr>
           <w:sz w:val="18"/>
         </w:rPr>
-        <w:t>28. Lakhina A., Crovella M., Diot C. Diagnosing Network-Wide Traffic Anomalies // Proceedings of ACM SIGCOMM 2004. 2004. P. 219–230. DOI: 10.1145/1015467.1015492.</w:t>
+        <w:t>28. Cao J., Ma M., Li H., Ma R., Sun Y., Yu P., Xiong L. A Survey on Security Aspects for 3GPP 5G Networks // IEEE Communications Surveys &amp; Tutorials. 2020. Vol. 22, no. 1. P. 170–195. DOI: 10.1109/COMST.2019.2951818.</w:t>
       </w:r>
     </w:p>
     <w:p>
@@ -2270,7 +3167,7 @@
         <w:rPr>
           <w:sz w:val="18"/>
         </w:rPr>
-        <w:t>29. Patcha A., Park J.-M. An Overview of Anomaly Detection Techniques: Existing Solutions and Latest Technological Trends // Computer Networks. 2007. Vol. 51, no. 12. P. 3448–3470. DOI: 10.1016/j.comnet.2007.02.001.</w:t>
+        <w:t>29. Tang Q., Ermis O., Nguyen C. D., De Oliveira A., Hirtzig A. A Systematic Analysis of 5G Networks With a Focus on 5G Core Security // IEEE Access. 2022. Vol. 10. P. 18298–18319. DOI: 10.1109/ACCESS.2022.3151000.</w:t>
       </w:r>
     </w:p>
     <w:p>
@@ -2282,7 +3179,7 @@
         <w:rPr>
           <w:sz w:val="18"/>
         </w:rPr>
-        <w:t>30. Матвеев В. А., Бельфер Р. А., Глинская Е. В. Оценка уровня риска безопасности атаки DoS-функций маршрутизации системы сигнализации ОКС-7 в сети GSM // Вестник МГТУ им. Н. Э. Баумана. Сер. Приборостроение. 2015. № 4. С. 127–138. DOI: 10.18698/0236-3933-2015-4-127-138.</w:t>
+        <w:t>30. Køien G. M. On Threats to the 5G Service Based Architecture // Wireless Personal Communications. 2021. Vol. 119. P. 97–116. DOI: 10.1007/s11277-021-08200-0.</w:t>
       </w:r>
     </w:p>
     <w:p>
@@ -2294,7 +3191,7 @@
         <w:rPr>
           <w:sz w:val="18"/>
         </w:rPr>
-        <w:t>31. Open5GS Project. Open5GS: Open Source Implementation of 5G Core and EPC. URL: https://github.com/open5gs/open5gs (дата обращения: 09.10.2026).</w:t>
+        <w:t>31. Loureiro L., Pereira V., Cruz T., Simões P. Enhancing 5G Core Security with eBPF/XDP // IEEE/IFIP NOMS. 2024. DOI: 10.1109/NOMS59830.2024.10575063.</w:t>
       </w:r>
     </w:p>
     <w:p>
@@ -2306,7 +3203,7 @@
         <w:rPr>
           <w:sz w:val="18"/>
         </w:rPr>
-        <w:t>32. Wireshark Foundation. Wireshark User's Guide. URL: https://www.wireshark.org/docs/wsug_html_chunked/ (дата обращения: 09.10.2026).</w:t>
+        <w:t>32. Gopikrishnan A., Prakash A., Hein C., Mößner K., Corici M.-I., Magedanz T. Anomaly Detection using a Semi-Supervised Deep Learning Model on Open 5G Core Metrics during User-Equipment Registration // IEEE CSCN. 2023. P. 106–112. DOI: 10.1109/CSCN60443.2023.10453203.</w:t>
       </w:r>
     </w:p>
     <w:p>
@@ -2318,7 +3215,295 @@
         <w:rPr>
           <w:sz w:val="18"/>
         </w:rPr>
-        <w:t>33. The Tcpdump Group. tcpdump and libpcap. URL: https://www.tcpdump.org/ (дата обращения: 09.10.2026).</w:t>
+        <w:t>33. Dong Y., Yang T., Al Ishtiaq A. et al. CoreCrisis: Threat-Guided and Context-Aware Iterative Learning and Fuzzing of 5G Core Networks // 34th USENIX Security Symposium. 2025. P. 5287–5306.</w:t>
+      </w:r>
+    </w:p>
+    <w:p>
+      <w:pPr>
+        <w:spacing w:after="60"/>
+        <w:ind w:hanging="312" w:left="369"/>
+      </w:pPr>
+      <w:r>
+        <w:rPr>
+          <w:sz w:val="18"/>
+        </w:rPr>
+        <w:t>34. Machine Learning for Mirai Attack Detection in 5G-Enabled IoT Networks // Wireless Days. 2025. DOI: 10.1109/WD67713.2025.11302620. [Сведения об авторах требуют уточнения.]</w:t>
+      </w:r>
+    </w:p>
+    <w:p>
+      <w:pPr>
+        <w:spacing w:after="60"/>
+        <w:ind w:hanging="312" w:left="369"/>
+      </w:pPr>
+      <w:r>
+        <w:rPr>
+          <w:sz w:val="18"/>
+        </w:rPr>
+        <w:t>35. Denning D. E. An Intrusion-Detection Model // IEEE Transactions on Software Engineering. 1987. Vol. SE-13, no. 2. P. 222–232. DOI: 10.1109/TSE.1987.232894.</w:t>
+      </w:r>
+    </w:p>
+    <w:p>
+      <w:pPr>
+        <w:spacing w:after="60"/>
+        <w:ind w:hanging="312" w:left="369"/>
+      </w:pPr>
+      <w:r>
+        <w:rPr>
+          <w:sz w:val="18"/>
+        </w:rPr>
+        <w:t>36. Paxson V. Bro: A System for Detecting Network Intruders in Real-Time // Computer Networks. 1999. Vol. 31, no. 23–24. P. 2435–2463. DOI: 10.1016/S1389-1286(99)00112-7.</w:t>
+      </w:r>
+    </w:p>
+    <w:p>
+      <w:pPr>
+        <w:spacing w:after="60"/>
+        <w:ind w:hanging="312" w:left="369"/>
+      </w:pPr>
+      <w:r>
+        <w:rPr>
+          <w:sz w:val="18"/>
+        </w:rPr>
+        <w:t>37. Sommer R., Paxson V. Outside the Closed World: On Using Machine Learning for Network Intrusion Detection // 2010 IEEE Symposium on Security and Privacy. 2010. P. 305–316. DOI: 10.1109/SP.2010.25.</w:t>
+      </w:r>
+    </w:p>
+    <w:p>
+      <w:pPr>
+        <w:spacing w:after="60"/>
+        <w:ind w:hanging="312" w:left="369"/>
+      </w:pPr>
+      <w:r>
+        <w:rPr>
+          <w:sz w:val="18"/>
+        </w:rPr>
+        <w:t>38. Lakhina A., Crovella M., Diot C. Diagnosing Network-Wide Traffic Anomalies // Proceedings of ACM SIGCOMM 2004. 2004. P. 219–230. DOI: 10.1145/1015467.1015492.</w:t>
+      </w:r>
+    </w:p>
+    <w:p>
+      <w:pPr>
+        <w:spacing w:after="60"/>
+        <w:ind w:hanging="312" w:left="369"/>
+      </w:pPr>
+      <w:r>
+        <w:rPr>
+          <w:sz w:val="18"/>
+        </w:rPr>
+        <w:t>39. Patcha A., Park J.-M. An Overview of Anomaly Detection Techniques: Existing Solutions and Latest Technological Trends // Computer Networks. 2007. Vol. 51, no. 12. P. 3448–3470. DOI: 10.1016/j.comnet.2007.02.001.</w:t>
+      </w:r>
+    </w:p>
+    <w:p>
+      <w:pPr>
+        <w:spacing w:after="60"/>
+        <w:ind w:hanging="312" w:left="369"/>
+      </w:pPr>
+      <w:r>
+        <w:rPr>
+          <w:sz w:val="18"/>
+        </w:rPr>
+        <w:t>40. Bifet A., Gavaldà R. Learning from Time-Changing Data with Adaptive Windowing // SDM. 2007. P. 443–448. DOI: 10.1137/1.9781611972771.42.</w:t>
+      </w:r>
+    </w:p>
+    <w:p>
+      <w:pPr>
+        <w:spacing w:after="60"/>
+        <w:ind w:hanging="312" w:left="369"/>
+      </w:pPr>
+      <w:r>
+        <w:rPr>
+          <w:sz w:val="18"/>
+        </w:rPr>
+        <w:t>41. Das A., Hoffmann H., Aiken A. Flexible Windowing for Correlation-Aware Ranking in Anomalous Environments // IEEE ICDM. 2025. P. 1135–1144. DOI: 10.1109/ICDM65498.2025.00122.</w:t>
+      </w:r>
+    </w:p>
+    <w:p>
+      <w:pPr>
+        <w:spacing w:after="60"/>
+        <w:ind w:hanging="312" w:left="369"/>
+      </w:pPr>
+      <w:r>
+        <w:rPr>
+          <w:sz w:val="18"/>
+        </w:rPr>
+        <w:t>42. signal_network_sim. Экспериментальные протоколы и исходные данные Open5GS KIE: архивный пересчет, репликация и пакетная верификация. 2026. URL: https://github.com/verge88/signal_network_sim (дата обращения: 10.10.2026).</w:t>
+      </w:r>
+    </w:p>
+    <w:p>
+      <w:pPr>
+        <w:spacing w:after="60"/>
+        <w:ind w:hanging="312" w:left="369"/>
+      </w:pPr>
+      <w:r>
+        <w:rPr>
+          <w:sz w:val="18"/>
+        </w:rPr>
+        <w:t>43. Krawczyk H., Bellare M., Canetti R. HMAC: Keyed-Hashing for Message Authentication. RFC 2104. IETF, 1997. DOI: 10.17487/RFC2104.</w:t>
+      </w:r>
+    </w:p>
+    <w:p>
+      <w:pPr>
+        <w:spacing w:after="60"/>
+        <w:ind w:hanging="312" w:left="369"/>
+      </w:pPr>
+      <w:r>
+        <w:rPr>
+          <w:sz w:val="18"/>
+        </w:rPr>
+        <w:t>44. NIST. The Keyed-Hash Message Authentication Code (HMAC). FIPS PUB 198-1. 2008. DOI: 10.6028/NIST.FIPS.198-1.</w:t>
+      </w:r>
+    </w:p>
+    <w:p>
+      <w:pPr>
+        <w:spacing w:after="60"/>
+        <w:ind w:hanging="312" w:left="369"/>
+      </w:pPr>
+      <w:r>
+        <w:rPr>
+          <w:sz w:val="18"/>
+        </w:rPr>
+        <w:t>45. Nystrom M. Identifiers and Test Vectors for HMAC-SHA-224, HMAC-SHA-256, HMAC-SHA-384, and HMAC-SHA-512. RFC 4231. IETF, 2005. DOI: 10.17487/RFC4231.</w:t>
+      </w:r>
+    </w:p>
+    <w:p>
+      <w:pPr>
+        <w:spacing w:after="60"/>
+        <w:ind w:hanging="312" w:left="369"/>
+      </w:pPr>
+      <w:r>
+        <w:rPr>
+          <w:sz w:val="18"/>
+        </w:rPr>
+        <w:t>46. NIST. Secure Hash Standard (SHS). FIPS PUB 180-4. 2015. DOI: 10.6028/NIST.FIPS.180-4.</w:t>
+      </w:r>
+    </w:p>
+    <w:p>
+      <w:pPr>
+        <w:spacing w:after="60"/>
+        <w:ind w:hanging="312" w:left="369"/>
+      </w:pPr>
+      <w:r>
+        <w:rPr>
+          <w:sz w:val="18"/>
+        </w:rPr>
+        <w:t>47. Adams C., Cain P., Pinkas D., Zuccherato R. Internet X.509 Public Key Infrastructure Time-Stamp Protocol (TSP). RFC 3161. IETF, 2001. DOI: 10.17487/RFC3161.</w:t>
+      </w:r>
+    </w:p>
+    <w:p>
+      <w:pPr>
+        <w:spacing w:after="60"/>
+        <w:ind w:hanging="312" w:left="369"/>
+      </w:pPr>
+      <w:r>
+        <w:rPr>
+          <w:sz w:val="18"/>
+        </w:rPr>
+        <w:t>48. Kent K., Souppaya M. Guide to Computer Security Log Management. NIST SP 800-92. NIST, 2006. DOI: 10.6028/NIST.SP.800-92.</w:t>
+      </w:r>
+    </w:p>
+    <w:p>
+      <w:pPr>
+        <w:spacing w:after="60"/>
+        <w:ind w:hanging="312" w:left="369"/>
+      </w:pPr>
+      <w:r>
+        <w:rPr>
+          <w:sz w:val="18"/>
+        </w:rPr>
+        <w:t>49. Dempsey K., Chawla N., Johnson A., Johnston R., Jones A. C., Orebaugh A., Scholl M., Stine K. Information Security Continuous Monitoring (ISCM) for Federal Information Systems and Organizations. NIST SP 800-137. NIST, 2011. DOI: 10.6028/NIST.SP.800-137.</w:t>
+      </w:r>
+    </w:p>
+    <w:p>
+      <w:pPr>
+        <w:spacing w:after="60"/>
+        <w:ind w:hanging="312" w:left="369"/>
+      </w:pPr>
+      <w:r>
+        <w:rPr>
+          <w:sz w:val="18"/>
+        </w:rPr>
+        <w:t>50. Cichonski P., Millar T., Grance T., Scarfone K. Computer Security Incident Handling Guide. NIST SP 800-61 Rev. 2. NIST, 2012. DOI: 10.6028/NIST.SP.800-61r2.</w:t>
+      </w:r>
+    </w:p>
+    <w:p>
+      <w:pPr>
+        <w:spacing w:after="60"/>
+        <w:ind w:hanging="312" w:left="369"/>
+      </w:pPr>
+      <w:r>
+        <w:rPr>
+          <w:sz w:val="18"/>
+        </w:rPr>
+        <w:t>51. Datar M., Gionis A., Indyk P., Motwani R. Maintaining Stream Statistics over Sliding Windows // SIAM Journal on Computing. 2002. Vol. 31, no. 6. P. 1794–1813. DOI: 10.1137/S0097539701398363.</w:t>
+      </w:r>
+    </w:p>
+    <w:p>
+      <w:pPr>
+        <w:spacing w:after="60"/>
+        <w:ind w:hanging="312" w:left="369"/>
+      </w:pPr>
+      <w:r>
+        <w:rPr>
+          <w:sz w:val="18"/>
+        </w:rPr>
+        <w:t>52. Mirsky Y., Doitshman T., Elovici Y., Shabtai A. Kitsune: An Ensemble of Autoencoders for Online Network Intrusion Detection // NDSS Symposium. 2018. DOI: 10.14722/ndss.2018.23204.</w:t>
+      </w:r>
+    </w:p>
+    <w:p>
+      <w:pPr>
+        <w:spacing w:after="60"/>
+        <w:ind w:hanging="312" w:left="369"/>
+      </w:pPr>
+      <w:r>
+        <w:rPr>
+          <w:sz w:val="18"/>
+        </w:rPr>
+        <w:t>53. USENIX Security Symposium. Artifact Evaluation: Availability, Functionality and Reproducibility Requirements. 2026. URL: https://www.usenix.org/conference/usenixsecurity26 (дата обращения: 10.10.2026).</w:t>
+      </w:r>
+    </w:p>
+    <w:p>
+      <w:pPr>
+        <w:spacing w:after="60"/>
+        <w:ind w:hanging="312" w:left="369"/>
+      </w:pPr>
+      <w:r>
+        <w:rPr>
+          <w:sz w:val="18"/>
+        </w:rPr>
+        <w:t>54. Davis J., Goadrich M. The Relationship Between Precision-Recall and ROC Curves // ICML. 2006. P. 233–240. DOI: 10.1145/1143844.1143874.</w:t>
+      </w:r>
+    </w:p>
+    <w:p>
+      <w:pPr>
+        <w:spacing w:after="60"/>
+        <w:ind w:hanging="312" w:left="369"/>
+      </w:pPr>
+      <w:r>
+        <w:rPr>
+          <w:sz w:val="18"/>
+        </w:rPr>
+        <w:t>55. Wilcoxon F. Individual Comparisons by Ranking Methods // Biometrics Bulletin. 1945. Vol. 1, no. 6. P. 80–83. DOI: 10.2307/3001968.</w:t>
+      </w:r>
+    </w:p>
+    <w:p>
+      <w:pPr>
+        <w:spacing w:after="60"/>
+        <w:ind w:hanging="312" w:left="369"/>
+      </w:pPr>
+      <w:r>
+        <w:rPr>
+          <w:sz w:val="18"/>
+        </w:rPr>
+        <w:t>56. Holm S. A Simple Sequentially Rejective Multiple Test Procedure // Scandinavian Journal of Statistics. 1979. Vol. 6, no. 2. P. 65–70.</w:t>
+      </w:r>
+    </w:p>
+    <w:p>
+      <w:pPr>
+        <w:spacing w:after="60"/>
+        <w:ind w:hanging="312" w:left="369"/>
+      </w:pPr>
+      <w:r>
+        <w:rPr>
+          <w:sz w:val="18"/>
+        </w:rPr>
+        <w:t>57. The Tcpdump Group. tcpdump and libpcap. URL: https://www.tcpdump.org/ (дата обращения: 09.10.2026).</w:t>
       </w:r>
     </w:p>
     <w:p>

</xml_diff>